<commit_message>
docs: align TCC proposal and README with verified implementation
</commit_message>
<xml_diff>
--- a/FieldNode_Proposta_TCC_v5.docx
+++ b/FieldNode_Proposta_TCC_v5.docx
@@ -589,12 +589,7 @@
         <w:spacing w:before="0" w:after="160" w:line="320" w:lineRule="auto"/>
       </w:pPr>
       <w:r>
-        <w:rPr>
-          <w:rFonts w:ascii="Calibri" w:hAnsi="Calibri"/>
-          <w:color w:val="24313A"/>
-          <w:sz w:val="22"/>
-        </w:rPr>
-        <w:t>A análise de risco combina regras determinísticas e Isolation Forest como sinais complementares. A PoC de decisão agentiva é mantida como experimento condicionado a chave externa, Event elegível e resposta auditável; não é requisito para afirmar que o closed loop básico funciona.</w:t>
+        <w:t>A análise de risco combina regras ponderadas e thresholds determinísticos com Isolation Forest como sinal complementar de detecção não supervisionada. Nenhum desses elementos é apresentado como modelo supervisionado validado de previsão de falhas mecânicas.</w:t>
       </w:r>
     </w:p>
     <w:p>
@@ -603,13 +598,15 @@
         <w:keepNext/>
       </w:pPr>
       <w:r>
-        <w:rPr>
-          <w:rFonts w:ascii="Calibri" w:hAnsi="Calibri"/>
-          <w:b/>
-          <w:color w:val="2E74B5"/>
-          <w:sz w:val="32"/>
-        </w:rPr>
-        <w:t>6. Resultados verificáveis até a Semana 10</w:t>
+        <w:t>6. Estado do ciclo atual</w:t>
+      </w:r>
+    </w:p>
+    <w:p>
+      <w:pPr>
+        <w:pStyle w:val="Heading2"/>
+      </w:pPr>
+      <w:r>
+        <w:t>6.1 O que está implementado e evidenciado neste ciclo</w:t>
       </w:r>
     </w:p>
     <w:p>
@@ -722,6 +719,24 @@
           <w:sz w:val="22"/>
         </w:rPr>
         <w:t>roteiro de banca e respostas de pressão técnica documentados.</w:t>
+      </w:r>
+    </w:p>
+    <w:p>
+      <w:pPr>
+        <w:pStyle w:val="Heading2"/>
+      </w:pPr>
+      <w:r>
+        <w:t>6.2 Roadmap futuro</w:t>
+      </w:r>
+    </w:p>
+    <w:p>
+      <w:r>
+        <w:t>A integração física com ESP32 e sensores identificados, a medição de ESP-NOW, a capacidade de retenção por 30 dias no hardware-alvo, a validação progressiva em campo e as integrações CAN/J1939 ou ISOBUS permanecem como etapas futuras. O código e os ensaios atuais sustentam um cliente Python de bancada com outbox SQLite e sincronização após reconexão; não sustentam essas capacidades físicas.</w:t>
+      </w:r>
+    </w:p>
+    <w:p>
+      <w:r>
+        <w:t>Também permanecem no roadmap a formação de um dataset operacional rotulado e a avaliação supervisionada de manutenção, condicionadas a volume, protocolo de rotulagem e validação temporal suficientes. O Isolation Forest é descrito como detecção não supervisionada de anomalias; as decisões atuais usam regras e thresholds, não uma previsão supervisionada validada de falha mecânica.</w:t>
       </w:r>
     </w:p>
     <w:p>

</xml_diff>